<commit_message>
Rebuild dist deliverables with the 158-center correction
Word output is unchanged in layout. The PDFs were re-rendered with WeasyPrint
69.0 rather than the version originally used, which repaginates the full
report from 104 to 109 pages; requirements.txt pins only weasyprint>=60.
Re-run 'make pdf' against the originally pinned version to restore the
104-page typesetting if the layout matters.

assets/reference.docx is generated on first build, so it is now ignored.
</commit_message>
<xml_diff>
--- a/dist/CDS-Child-Care-Policy-Landscape-2026-Executive-Summary.docx
+++ b/dist/CDS-Child-Care-Policy-Landscape-2026-Executive-Summary.docx
@@ -246,7 +246,7 @@
           <w:bCs/>
           <w:b/>
         </w:rPr>
-        <w:t xml:space="preserve">three are unconfirmed and should be resolved this month — Georgia, North Carolina and Tennessee, which together account for 159 centers.</w:t>
+        <w:t xml:space="preserve">three are unconfirmed and should be resolved this month — Georgia, North Carolina and Tennessee, which together account for 158 centers.</w:t>
       </w:r>
     </w:p>
     <w:p>
@@ -1071,7 +1071,7 @@
               <w:jc w:val="left"/>
             </w:pPr>
             <w:r>
-              <w:t xml:space="preserve">Resolve subsidy payment basis in Georgia, North Carolina and Tennessee — 159 centers</w:t>
+              <w:t xml:space="preserve">Resolve subsidy payment basis in Georgia, North Carolina and Tennessee — 158 centers</w:t>
             </w:r>
           </w:p>
         </w:tc>

</xml_diff>